<commit_message>
Ch7: compress corridor and committee portraits; Ch8: agency charge replaces chosen-one, trim opening, cut prophecy negation; tracker: mystic-layer arc flag + myth verification items
</commit_message>
<xml_diff>
--- a/manuscript/chapter-07-the-knocking.docx
+++ b/manuscript/chapter-07-the-knocking.docx
@@ -215,7 +215,7 @@
     </w:p>
     <w:p>
       <w:r>
-        <w:t>Elara washed her face again, checked the collar twice, and fastened every clasp without looking at herself in the mirror. She checked the collar twice. The second time, her fingers missed the clasp and caught on the edge of the metal. She steadied herself, re-seated it, and pulled the collar closed with a firmer tug.</w:t>
+        <w:t>Elara washed her face again and fastened every clasp without looking at herself in the mirror. She checked the collar twice. The second time, her fingers missed the clasp and caught on the edge of the metal. She steadied herself, re-seated it, and pulled the collar closed with a firmer tug.</w:t>
       </w:r>
     </w:p>
     <w:p>
@@ -230,27 +230,7 @@
     </w:p>
     <w:p>
       <w:r>
-        <w:t>At the turn into the Corridor of Knowledge, the architecture changed without becoming grander. Drona did not need height or ceremony to announce itself. Its corridor was narrow, pale, and lined with glass cases sealed against dust, moisture, and careless hands.</w:t>
-      </w:r>
-    </w:p>
-    <w:p>
-      <w:r>
-        <w:t>The first cases held the instruments of people who had built knowledge from almost nothing: a cracked lens, a brass measuring arm, a set of bone-handled tools used to study the stars before Trinity had a sky of its own. The labels named astronomers, physicians, mathematicians, and engineers whose work had survived wars, migrations, and the collapse of institutions that once believed themselves permanent.</w:t>
-      </w:r>
-    </w:p>
-    <w:p>
-      <w:r>
-        <w:t>Farther along, portraits of great inventors and scientists looked down from the walls. Some were old, some young, some visibly ill, and several had been painted without flattering symmetry. Drona preserved the hands more carefully than the faces: fingers stained with ink, a thumb pressed against a specimen, a palm resting on an unfinished diagram.</w:t>
-      </w:r>
-    </w:p>
-    <w:p>
-      <w:r>
-        <w:t>Between the portraits stood smaller shrines to the ancient sanyashis, teachers who had treated discipline as a way of seeing rather than a way of ruling. Their texts were displayed beside religious commentaries, scientific notebooks, medical treatises, and mathematical tables. Nothing in the corridor claimed that one kind of knowledge had defeated the others. The cases held them together beneath the same controlled light, as if inquiry required room for doubt, devotion, measurement, and contradiction.</w:t>
-      </w:r>
-    </w:p>
-    <w:p>
-      <w:r>
-        <w:t>The oldest books rested inside vacuum-sealed glass cases. Their pages had browned at the edges, but the ink remained legible. A copy of an early astronomical text lay open beside a translation of a religious epic. A medical manual shared a case with a field notebook on plant behavior. The arrangement would have looked disorderly to a casual eye. To Drona, the disorder was the point. Knowledge had never advanced in a straight line.</w:t>
+        <w:t>At the turn into the Corridor of Knowledge, the architecture changed without becoming grander. Drona did not need height or ceremony to announce itself. Its corridor was narrow, pale, and lined with sealed glass cases: a cracked lens, a brass measuring arm, bone-handled tools used to study the stars before Trinity had a sky of its own. Portraits of scientists hung between shrines to the ancient sanyashis, and the oldest books lay open beside one another — an astronomical text beside a religious epic, a medical manual beside a field notebook on plant behavior. The arrangement would have looked disorderly to a casual eye. To Drona, the disorder was the point. Knowledge had never advanced in a straight line.</w:t>
       </w:r>
     </w:p>
     <w:p>
@@ -265,27 +245,7 @@
     </w:p>
     <w:p>
       <w:r>
-        <w:t>Elara kept walking. The Corridor of Knowledge narrowed before it ended, then opened into the conference wing.</w:t>
-      </w:r>
-    </w:p>
-    <w:p>
-      <w:r>
-        <w:t>The first room beyond it held a cluster of young researchers around a suspended model of a river system. An elder stood among them with one hand resting on the table, asking questions instead of giving answers. The students moved pieces of blue glass across the model, testing what happened when a channel narrowed, when a settlement took too much water, when one decision reached a place no one in the room had expected.</w:t>
-      </w:r>
-    </w:p>
-    <w:p>
-      <w:r>
-        <w:t>In the next room, two students worked over a damaged painting beneath a white examination lamp. Their mentor sat beside them rather than across from them, guiding the angle of a brush with two fingers and stopping whenever the student tried to correct a mark too quickly. A third room held a boy with a stringed instrument, repeating the same passage while an older woman listened with her eyes closed. She raised one hand when the rhythm lost its balance. He began again.</w:t>
-      </w:r>
-    </w:p>
-    <w:p>
-      <w:r>
-        <w:t>The rooms carried the old structure of the gurukul into Trinity's sealed future. A teacher was never only an authority or a source of instruction. The teacher guided the student through the discipline of attention, guarded the fragile parts of the mind, challenged the convenient answer, and kept watch over the difference between knowledge that enlarged a person and knowledge that merely made a system more powerful.</w:t>
-      </w:r>
-    </w:p>
-    <w:p>
-      <w:r>
-        <w:t>Drona claimed the tradition had survived because it looked forward. Its elders were teachers, mentors, friends when friendship was needed, and guardians when a student had not yet learned what required protection. They curated the mind without pretending to own the spirit. At least, that was the principle preserved in the old texts.</w:t>
+        <w:t>The corridor narrowed before it ended, then opened into the conference wing, where the rooms kept the old structure of the gurukul. Young researchers stood around a suspended river model while an elder asked questions instead of giving answers. Two students restored a damaged painting while their mentor guided the angle of a brush with two fingers. A boy repeated the same passage on a stringed instrument until an older woman's raised hand told him to begin again. In every room, a teacher kept watch over the difference between knowledge that enlarged a person and knowledge that merely made a system more powerful.</w:t>
       </w:r>
     </w:p>
     <w:p>
@@ -310,27 +270,17 @@
     </w:p>
     <w:p>
       <w:r>
-        <w:t>There were three others in the chairs nearest the center of the table, people she had never seen before, and by then she had the terrible instinct that this might be the first and last time their faces would ever meet. One of them was clothed in a long, plain robe of saffron and ash, the kind of garment that belonged to a temple, a retreat, or a lineage of teachers who did not care whether the world called them holy or simply disciplined. It was not the sort of dress Drona prized. Drona had always maintained that learning must not be overrun by ritual, nor education governed by doctrine, and yet here was a figure who looked as if he had stepped out of an old vow and into a room where procedure was meant to decide everything.</w:t>
+        <w:t>There were three others in the chairs nearest the center of the table, people she had never seen before, and by then she had the terrible instinct that this might be the first and last time their faces would ever meet. One of them was clothed in a long, plain robe of saffron and ash — not the dress Drona prized, in a house that had always insisted learning must not be governed by doctrine.</w:t>
       </w:r>
     </w:p>
     <w:p>
       <w:r>
-        <w:t>The robe was not what unsettled her. It was the hand.</w:t>
+        <w:t>The robe was not what unsettled her. It was the hand. His right wrist rested on the table, the cuff of his sleeve threaded with seven small stones set in a narrow line. Elara remembered the old Vedic syllabi: four stones for the four Vedas, three for the teachings that carried interpretation, silence, and living transmission. He wore his discipline where a record would have carried it.</w:t>
       </w:r>
     </w:p>
     <w:p>
       <w:r>
-        <w:t>His right wrist rested on the table, and the cuff of his sleeve had been threaded with seven small stones set in a narrow line: a deep red carnelian, a pale amber, a blue sapphire, a green malachite, a white pearl, a smoky opal, and a dark lapis. The arrangement was too deliberate to be ornament, too old to be decorative. Elara remembered the old Vedic syllabi, the ways teachers used visible symbols to mark a discipline one could not reduce to a single text. The red stone recalled the Rigveda, the hymns of praise and the language of invocation; the blue sapphire belonged to the Samaveda, the music of sound and memory; the amber spoke for the Yajurveda, the ritual formulae and ordered action; the pearl for the Atharvaveda, the medicine, the practical lore, the hidden knowledge of body and breath. The remaining three stones, green, opal, and lapis, were not extra ornaments. They were the old tertiary threads a scholar might use to mark the Brahmanas, the Aranyakas, and the Upanishads—teachings that did not sit neatly under one title but carried the weight of interpretation, silence, and living transmission.</w:t>
-      </w:r>
-    </w:p>
-    <w:p>
-      <w:r>
-        <w:t>The room seemed to flatten around her. The instruction she had rehearsed in her quarters, the careful emphasis on procedure and incomplete evidence, all of it thinned to a single thought: the committee had not summoned her for a routine assessment. It had summoned her to answer before people who belonged to more than one kind of authority, and one of them had already decided that the truth of a life could be carried in a hand as clearly as in a record.</w:t>
-      </w:r>
-    </w:p>
-    <w:p>
-      <w:r>
-        <w:t>She understood, then, that even if the man in the robe was a religious teacher, the knowledge he carried was precisely what had brought him into the room. The ancient texts had never belonged to one domain alone. They were spiritual, yes, but also worldly, practical, and political. Their truths had guided people through grief, trade, warfare, law, and memory. Justice was not a simple yes or no. It was a field of obligation, consequence, and interpretation, and the Vedas had been written to help human beings navigate that path with righteousness across the ages, when time itself could tell a story in more than one voice.</w:t>
+        <w:t>The instruction she had rehearsed in her quarters thinned to a single thought: the committee had not summoned her for a routine assessment. It had summoned her to answer before people who belonged to more than one kind of authority.</w:t>
       </w:r>
     </w:p>
     <w:p>
@@ -340,22 +290,7 @@
     </w:p>
     <w:p>
       <w:r>
-        <w:t>Her gaze slid to the next figure at the table and caught on the object in the person's hands before it registered the face above it. The cards were larger than ordinary playing cards, thick and matte, their edges beveled by hand. They looked old enough to have been inherited, not manufactured, and they were not arranged neatly in a deck. They were shuffled in a way that suggested habit, not ceremony, as if the person had spent years learning the shape of chance before accepting that chance was still only a kind of structure.</w:t>
-      </w:r>
-    </w:p>
-    <w:p>
-      <w:r>
-        <w:t>The figure looked like someone from the old astrological houses, or perhaps from the narrower tradition of omen-readers who had once plotted the sky for kings, harvests, and marriages, but there was no trace of showmanship in the posture. No dramatic pause. No ritual performance. The cards were simply there, as if they belonged in the same category of tools as a measuring rod, a prayer wheel, or a ledger. Elara knew that this was not a fortune-telling room. Trinity did not permit the future to be decided by symbols when the city itself was built on records, counters, and measured risk. Yet the cards were impossible to dismiss. They carried the same logic as the stones on the robe, the same quiet insistence that life was not a simple chain of cause and effect but a map of choices drawn in layers.</w:t>
-      </w:r>
-    </w:p>
-    <w:p>
-      <w:r>
-        <w:t>It was not that she believed in divination. It was that she could feel why a person like this had been invited to sit in judgment. The cards were not prophecy in the vulgar sense; they were an instrument for reading sequences, patterns, and the hidden weight of decision. In the old traditions, such things were not separate from law or ethics. They were methods for noticing how a path widened or narrowed according to intention, timing, and consequence. That was the link, and it was not sentimental. It was practical. It made her think of the same old instinct that had brought the Vedas into the room at all: some questions could not be answered with a single record, and some futures did not begin as a single choice.</w:t>
-      </w:r>
-    </w:p>
-    <w:p>
-      <w:r>
-        <w:t>The man in the robe had brought ancient knowledge into the room. This figure had brought another form of discernment, one that dealt not in static facts but in the shapes a decision might take when repeated across a life. Elara could not say, exactly, why the committee had included both, only that the room seemed arranged to measure not just what had happened, but what kind of mind it took to read the meaning of it.</w:t>
+        <w:t>The next figure at the table held cards older than manufacture — thick, hand-beveled, shuffled with habit rather than ceremony. No dramatic pause, no ritual performance; the cards sat in those hands the way a measuring rod or a ledger might, an instrument rather than an act. Trinity did not permit the future to be decided by symbols, and yet here they were, carrying the same quiet insistence as the stones on the robe: some questions could not be answered with a single record, and some futures did not begin as a single choice.</w:t>
       </w:r>
     </w:p>
     <w:p>
@@ -365,12 +300,7 @@
     </w:p>
     <w:p>
       <w:r>
-        <w:t>The last person in the room was seated at the extreme end of the table, and she was unlike the others in a way that struck Elara before she could name it. There were no ornate markings on her body, no visible sign of a lineage or office, no dress meant to impress the eye. She wore a plain gray shawl over a simple cotton tunic, and her face was lined with the patience of years. Elder Anandi's presence had already reminded Elara that women held authority within Drona; this elder's power came from a different source. At first glance she looked almost ordinary, the kind of person who might vanish into a corridor if the room were not already holding its breath. But the impression did not hold. It was impossible to look away from her eyes. They held a steadiness that felt older than the room itself, as if they had been taught to watch a person until the person was stripped of all pretense.</w:t>
-      </w:r>
-    </w:p>
-    <w:p>
-      <w:r>
-        <w:t>Elara had worked beside women in the archives, training halls, clinics, and classrooms. Drona's hierarchy was not a simple story of men above women, even if the older histories carried the marks of that imbalance. What unsettled her now was not that another woman held authority. It was the particular kind of authority this elder carried: unadorned, unhurried, and so certain that it seemed to precede the room itself. She did not need a robe, a title, or a public display. Her presence made silence feel like a deliberate instrument, and that restraint gave her significance no ceremony could have supplied.</w:t>
+        <w:t>The last person sat at the extreme end of the table, and she was unlike the others in a way that struck Elara before she could name it. A plain gray shawl over a simple cotton tunic, a face lined with the patience of years, and no mark of lineage or office anywhere on her. It was impossible to look away from her eyes. They held a steadiness that felt older than the room itself, as if they had been taught to watch a person until the person was stripped of all pretense. She needed no robe and no title. Her stillness made silence feel like a deliberate instrument, and that restraint gave her a significance no ceremony could have supplied.</w:t>
       </w:r>
     </w:p>
     <w:p>

</xml_diff>